<commit_message>
docs: court application names the 1913 certificate and reconciles the mother's name
</commit_message>
<xml_diff>
--- a/docs/correspondence/2026-10-27-bezirksgericht-salzburg-antrag.docx
+++ b/docs/correspondence/2026-10-27-bezirksgericht-salzburg-antrag.docx
@@ -239,7 +239,7 @@
           <w:sz-cs w:val="29"/>
           <w:spacing w:val="0"/>
         </w:rPr>
-        <w:t xml:space="preserve">Maria Gabriele Gräfin Czernin von Chudenic, geb. Gräfin von Orsini-Rosenberg (1879–1951) – Mutter von</w:t>
+        <w:t xml:space="preserve">Maria Gabriele Gräfin Czernin von Chudenic, geb. Gräfin von Orsini-Rosenberg, geb. 21. Mai 1879 in Wien (im Geburts- und Taufschein ihres Sohnes als „Reichsgräfin Gabriele Anna von Orsini und Rosenberg, geb. 21. Mai 1879 in Wien VII.“ genannt) – Mutter von</w:t>
       </w:r>
     </w:p>
     <w:p>
@@ -367,7 +367,7 @@
           <w:sz-cs w:val="29"/>
           <w:spacing w:val="0"/>
         </w:rPr>
-        <w:t xml:space="preserve">Taufschein / Geburtsurkunde Alexander Czernin, Wien 1913</w:t>
+        <w:t xml:space="preserve">Geburts- und Taufschein Alexander Friedrich Josef Paul Maria Graf Czernin von Chudenic, Pfarre St. Karl, Wien, Geburts- und Taufbuch Tom. XVII, fol. 186, ausgestellt am 30. Mai 1921</w:t>
       </w:r>
     </w:p>
     <w:p>

</xml_diff>